<commit_message>
Add group meeting report #1
</commit_message>
<xml_diff>
--- a/Group Meeting Report .docx
+++ b/Group Meeting Report .docx
@@ -357,6 +357,7 @@
               <w:showingPlcHdr/>
               <w15:appearance w15:val="hidden"/>
             </w:sdtPr>
+            <w:sdtEndPr/>
             <w:sdtContent>
               <w:p>
                 <w:pPr>
@@ -389,6 +390,7 @@
               <w:showingPlcHdr/>
               <w15:appearance w15:val="hidden"/>
             </w:sdtPr>
+            <w:sdtEndPr/>
             <w:sdtContent>
               <w:p>
                 <w:pPr>
@@ -421,6 +423,7 @@
               <w:showingPlcHdr/>
               <w15:appearance w15:val="hidden"/>
             </w:sdtPr>
+            <w:sdtEndPr/>
             <w:sdtContent>
               <w:p>
                 <w:pPr>
@@ -637,6 +640,7 @@
                 <w:showingPlcHdr/>
                 <w15:appearance w15:val="hidden"/>
               </w:sdtPr>
+              <w:sdtEndPr/>
               <w:sdtContent>
                 <w:r>
                   <w:rPr>
@@ -693,6 +697,7 @@
                 <w:showingPlcHdr/>
                 <w15:appearance w15:val="hidden"/>
               </w:sdtPr>
+              <w:sdtEndPr/>
               <w:sdtContent>
                 <w:r>
                   <w:rPr>
@@ -832,6 +837,7 @@
                 <w:showingPlcHdr/>
                 <w15:appearance w15:val="hidden"/>
               </w:sdtPr>
+              <w:sdtEndPr/>
               <w:sdtContent>
                 <w:r>
                   <w:rPr>
@@ -940,6 +946,7 @@
         <w:showingPlcHdr/>
         <w15:appearance w15:val="hidden"/>
       </w:sdtPr>
+      <w:sdtEndPr/>
       <w:sdtContent>
         <w:p>
           <w:pPr>
@@ -1042,6 +1049,7 @@
                 <w:showingPlcHdr/>
                 <w15:appearance w15:val="hidden"/>
               </w:sdtPr>
+              <w:sdtEndPr/>
               <w:sdtContent>
                 <w:r>
                   <w:rPr>
@@ -1093,6 +1101,7 @@
           <w:showingPlcHdr/>
           <w15:appearance w15:val="hidden"/>
         </w:sdtPr>
+        <w:sdtEndPr/>
         <w:sdtContent>
           <w:r>
             <w:rPr>
@@ -1154,6 +1163,7 @@
           <w:showingPlcHdr/>
           <w15:appearance w15:val="hidden"/>
         </w:sdtPr>
+        <w:sdtEndPr/>
         <w:sdtContent>
           <w:r>
             <w:rPr>
@@ -1260,6 +1270,7 @@
                 <w:showingPlcHdr/>
                 <w15:appearance w15:val="hidden"/>
               </w:sdtPr>
+              <w:sdtEndPr/>
               <w:sdtContent>
                 <w:r>
                   <w:rPr>
@@ -1299,6 +1310,7 @@
                 <w:showingPlcHdr/>
                 <w15:appearance w15:val="hidden"/>
               </w:sdtPr>
+              <w:sdtEndPr/>
               <w:sdtContent>
                 <w:r>
                   <w:rPr>
@@ -1338,6 +1350,7 @@
                 <w:showingPlcHdr/>
                 <w15:appearance w15:val="hidden"/>
               </w:sdtPr>
+              <w:sdtEndPr/>
               <w:sdtContent>
                 <w:r>
                   <w:rPr>
@@ -1688,6 +1701,7 @@
                 <w:showingPlcHdr/>
                 <w15:appearance w15:val="hidden"/>
               </w:sdtPr>
+              <w:sdtEndPr/>
               <w:sdtContent>
                 <w:r>
                   <w:rPr>
@@ -1739,6 +1753,7 @@
           <w:showingPlcHdr/>
           <w15:appearance w15:val="hidden"/>
         </w:sdtPr>
+        <w:sdtEndPr/>
         <w:sdtContent>
           <w:r>
             <w:rPr>
@@ -1782,6 +1797,7 @@
           <w:showingPlcHdr/>
           <w15:appearance w15:val="hidden"/>
         </w:sdtPr>
+        <w:sdtEndPr/>
         <w:sdtContent>
           <w:r>
             <w:rPr>
@@ -1859,6 +1875,7 @@
                 <w:showingPlcHdr/>
                 <w15:appearance w15:val="hidden"/>
               </w:sdtPr>
+              <w:sdtEndPr/>
               <w:sdtContent>
                 <w:r>
                   <w:rPr>
@@ -1896,6 +1913,7 @@
                 <w:showingPlcHdr/>
                 <w15:appearance w15:val="hidden"/>
               </w:sdtPr>
+              <w:sdtEndPr/>
               <w:sdtContent>
                 <w:r>
                   <w:rPr>
@@ -1933,6 +1951,7 @@
                 <w:showingPlcHdr/>
                 <w15:appearance w15:val="hidden"/>
               </w:sdtPr>
+              <w:sdtEndPr/>
               <w:sdtContent>
                 <w:r>
                   <w:rPr>
@@ -2234,6 +2253,7 @@
                 <w:showingPlcHdr/>
                 <w15:appearance w15:val="hidden"/>
               </w:sdtPr>
+              <w:sdtEndPr/>
               <w:sdtContent>
                 <w:r>
                   <w:rPr>
@@ -2285,6 +2305,7 @@
           <w:showingPlcHdr/>
           <w15:appearance w15:val="hidden"/>
         </w:sdtPr>
+        <w:sdtEndPr/>
         <w:sdtContent>
           <w:r>
             <w:rPr>
@@ -2334,6 +2355,7 @@
           <w:showingPlcHdr/>
           <w15:appearance w15:val="hidden"/>
         </w:sdtPr>
+        <w:sdtEndPr/>
         <w:sdtContent>
           <w:r>
             <w:rPr>
@@ -2417,6 +2439,7 @@
                 <w:showingPlcHdr/>
                 <w15:appearance w15:val="hidden"/>
               </w:sdtPr>
+              <w:sdtEndPr/>
               <w:sdtContent>
                 <w:r>
                   <w:rPr>
@@ -2454,6 +2477,7 @@
                 <w:showingPlcHdr/>
                 <w15:appearance w15:val="hidden"/>
               </w:sdtPr>
+              <w:sdtEndPr/>
               <w:sdtContent>
                 <w:r>
                   <w:rPr>
@@ -2491,6 +2515,7 @@
                 <w:showingPlcHdr/>
                 <w15:appearance w15:val="hidden"/>
               </w:sdtPr>
+              <w:sdtEndPr/>
               <w:sdtContent>
                 <w:r>
                   <w:rPr>
@@ -2690,6 +2715,7 @@
           <w:showingPlcHdr/>
           <w15:appearance w15:val="hidden"/>
         </w:sdtPr>
+        <w:sdtEndPr/>
         <w:sdtContent>
           <w:r>
             <w:rPr>
@@ -2723,6 +2749,7 @@
           <w:showingPlcHdr/>
           <w15:appearance w15:val="hidden"/>
         </w:sdtPr>
+        <w:sdtEndPr/>
         <w:sdtContent>
           <w:r>
             <w:rPr>
@@ -2746,6 +2773,7 @@
         <w:showingPlcHdr/>
         <w15:appearance w15:val="hidden"/>
       </w:sdtPr>
+      <w:sdtEndPr/>
       <w:sdtContent>
         <w:p>
           <w:pPr>
@@ -2789,6 +2817,7 @@
         <w:showingPlcHdr/>
         <w15:appearance w15:val="hidden"/>
       </w:sdtPr>
+      <w:sdtEndPr/>
       <w:sdtContent>
         <w:p>
           <w:pPr>
@@ -2938,6 +2967,7 @@
         <w:docPartUnique/>
       </w:docPartObj>
     </w:sdtPr>
+    <w:sdtEndPr/>
     <w:sdtContent>
       <w:sdt>
         <w:sdtPr>
@@ -2947,6 +2977,7 @@
             <w:docPartUnique/>
           </w:docPartObj>
         </w:sdtPr>
+        <w:sdtEndPr/>
         <w:sdtContent>
           <w:p>
             <w:pPr>
@@ -5236,6 +5267,7 @@
   </w:compat>
   <w:rsids>
     <w:rsidRoot w:val="002779AB"/>
+    <w:rsid w:val="000D4553"/>
     <w:rsid w:val="002779AB"/>
     <w:rsid w:val="00341793"/>
     <w:rsid w:val="003575C7"/>
@@ -5247,6 +5279,7 @@
     <w:rsid w:val="00893CC2"/>
     <w:rsid w:val="00A37952"/>
     <w:rsid w:val="00C926F6"/>
+    <w:rsid w:val="00D77CE4"/>
     <w:rsid w:val="00F07C5D"/>
     <w:rsid w:val="00F26517"/>
     <w:rsid w:val="00FD3709"/>
@@ -6126,21 +6159,6 @@
 </file>
 
 <file path=customXml/item1.xml><?xml version="1.0" encoding="utf-8"?>
-<p:properties xmlns:p="http://schemas.microsoft.com/office/2006/metadata/properties" xmlns:xsi="http://www.w3.org/2001/XMLSchema-instance" xmlns:pc="http://schemas.microsoft.com/office/infopath/2007/PartnerControls">
-  <documentManagement/>
-</p:properties>
-</file>
-
-<file path=customXml/item2.xml><?xml version="1.0" encoding="utf-8"?>
-<?mso-contentType ?>
-<FormTemplates xmlns="http://schemas.microsoft.com/sharepoint/v3/contenttype/forms">
-  <Display>DocumentLibraryForm</Display>
-  <Edit>DocumentLibraryForm</Edit>
-  <New>DocumentLibraryForm</New>
-</FormTemplates>
-</file>
-
-<file path=customXml/item3.xml><?xml version="1.0" encoding="utf-8"?>
 <ct:contentTypeSchema xmlns:ct="http://schemas.microsoft.com/office/2006/metadata/contentType" xmlns:ma="http://schemas.microsoft.com/office/2006/metadata/properties/metaAttributes" ct:_="" ma:_="" ma:contentTypeName="Document" ma:contentTypeID="0x01010021FF3BF40CCD11489C7593694C95B5EE" ma:contentTypeVersion="5" ma:contentTypeDescription="Create a new document." ma:contentTypeScope="" ma:versionID="0f55d8ddadf25351cdb08e8e82fe1ea8">
   <xsd:schema xmlns:xsd="http://www.w3.org/2001/XMLSchema" xmlns:xs="http://www.w3.org/2001/XMLSchema" xmlns:p="http://schemas.microsoft.com/office/2006/metadata/properties" xmlns:ns3="2f0470b4-47c5-4c14-ad46-72f8b378acfd" xmlns:ns4="3032a5e3-5993-49f6-b730-086e11975eaf" targetNamespace="http://schemas.microsoft.com/office/2006/metadata/properties" ma:root="true" ma:fieldsID="0781f59e628f971fb4ef0c186e6a0de8" ns3:_="" ns4:_="">
     <xsd:import namespace="2f0470b4-47c5-4c14-ad46-72f8b378acfd"/>
@@ -6311,24 +6329,22 @@
 </ct:contentTypeSchema>
 </file>
 
-<file path=customXml/itemProps1.xml><?xml version="1.0" encoding="utf-8"?>
-<ds:datastoreItem xmlns:ds="http://schemas.openxmlformats.org/officeDocument/2006/customXml" ds:itemID="{5A86B5EA-CD6A-44AC-ADB2-4CA45AFB352E}">
-  <ds:schemaRefs>
-    <ds:schemaRef ds:uri="http://schemas.microsoft.com/office/2006/metadata/properties"/>
-    <ds:schemaRef ds:uri="http://schemas.microsoft.com/office/infopath/2007/PartnerControls"/>
-  </ds:schemaRefs>
-</ds:datastoreItem>
+<file path=customXml/item2.xml><?xml version="1.0" encoding="utf-8"?>
+<?mso-contentType ?>
+<FormTemplates xmlns="http://schemas.microsoft.com/sharepoint/v3/contenttype/forms">
+  <Display>DocumentLibraryForm</Display>
+  <Edit>DocumentLibraryForm</Edit>
+  <New>DocumentLibraryForm</New>
+</FormTemplates>
 </file>
 
-<file path=customXml/itemProps2.xml><?xml version="1.0" encoding="utf-8"?>
-<ds:datastoreItem xmlns:ds="http://schemas.openxmlformats.org/officeDocument/2006/customXml" ds:itemID="{5542552F-FBC5-443F-B977-388D14297FB7}">
-  <ds:schemaRefs>
-    <ds:schemaRef ds:uri="http://schemas.microsoft.com/sharepoint/v3/contenttype/forms"/>
-  </ds:schemaRefs>
-</ds:datastoreItem>
+<file path=customXml/item3.xml><?xml version="1.0" encoding="utf-8"?>
+<p:properties xmlns:p="http://schemas.microsoft.com/office/2006/metadata/properties" xmlns:xsi="http://www.w3.org/2001/XMLSchema-instance" xmlns:pc="http://schemas.microsoft.com/office/infopath/2007/PartnerControls">
+  <documentManagement/>
+</p:properties>
 </file>
 
-<file path=customXml/itemProps3.xml><?xml version="1.0" encoding="utf-8"?>
+<file path=customXml/itemProps1.xml><?xml version="1.0" encoding="utf-8"?>
 <ds:datastoreItem xmlns:ds="http://schemas.openxmlformats.org/officeDocument/2006/customXml" ds:itemID="{C19EFC77-5989-4EDB-B85D-0DAD07F34557}">
   <ds:schemaRefs>
     <ds:schemaRef ds:uri="http://schemas.microsoft.com/office/2006/metadata/contentType"/>
@@ -6345,4 +6361,21 @@
     <ds:schemaRef ds:uri="http://schemas.microsoft.com/internal/obd"/>
   </ds:schemaRefs>
 </ds:datastoreItem>
+</file>
+
+<file path=customXml/itemProps2.xml><?xml version="1.0" encoding="utf-8"?>
+<ds:datastoreItem xmlns:ds="http://schemas.openxmlformats.org/officeDocument/2006/customXml" ds:itemID="{5542552F-FBC5-443F-B977-388D14297FB7}">
+  <ds:schemaRefs>
+    <ds:schemaRef ds:uri="http://schemas.microsoft.com/sharepoint/v3/contenttype/forms"/>
+  </ds:schemaRefs>
+</ds:datastoreItem>
+</file>
+
+<file path=customXml/itemProps3.xml><?xml version="1.0" encoding="utf-8"?>
+<ds:datastoreItem xmlns:ds="http://schemas.openxmlformats.org/officeDocument/2006/customXml" ds:itemID="{5A86B5EA-CD6A-44AC-ADB2-4CA45AFB352E}">
+  <ds:schemaRefs>
+    <ds:schemaRef ds:uri="http://schemas.microsoft.com/office/2006/metadata/properties"/>
+    <ds:schemaRef ds:uri="http://schemas.microsoft.com/office/infopath/2007/PartnerControls"/>
+  </ds:schemaRefs>
+</ds:datastoreItem>
 </file>
</xml_diff>